<commit_message>
Added Final Benchmark Comparison Table
</commit_message>
<xml_diff>
--- a/Evaluations/BenchmarkEvaluations/FinalEvaluation/BenchmarkComparison.docx
+++ b/Evaluations/BenchmarkEvaluations/FinalEvaluation/BenchmarkComparison.docx
@@ -331,7 +331,7 @@
         </w:tc>
         <w:tc>
           <w:tcPr>
-            <w:tcW w:w="401" w:type="pct"/>
+            <w:tcW w:w="400" w:type="pct"/>
             <w:tcBorders>
               <w:top w:val="single" w:sz="8" w:space="0" w:color="333333"/>
               <w:left w:val="single" w:sz="8" w:space="0" w:color="333333"/>
@@ -369,7 +369,7 @@
         </w:trPr>
         <w:tc>
           <w:tcPr>
-            <w:tcW w:w="953" w:type="pct"/>
+            <w:tcW w:w="954" w:type="pct"/>
             <w:gridSpan w:val="2"/>
             <w:tcBorders>
               <w:top w:val="single" w:sz="4" w:space="0" w:color="888888"/>
@@ -599,7 +599,7 @@
         </w:tc>
         <w:tc>
           <w:tcPr>
-            <w:tcW w:w="362" w:type="pct"/>
+            <w:tcW w:w="363" w:type="pct"/>
             <w:tcBorders>
               <w:top w:val="single" w:sz="4" w:space="0" w:color="888888"/>
               <w:left w:val="single" w:sz="4" w:space="0" w:color="888888"/>
@@ -777,7 +777,7 @@
         </w:tc>
         <w:tc>
           <w:tcPr>
-            <w:tcW w:w="401" w:type="pct"/>
+            <w:tcW w:w="400" w:type="pct"/>
             <w:tcBorders>
               <w:top w:val="single" w:sz="4" w:space="0" w:color="888888"/>
               <w:left w:val="single" w:sz="4" w:space="0" w:color="888888"/>
@@ -954,6 +954,9 @@
                 <w:szCs w:val="16"/>
               </w:rPr>
             </w:pPr>
+            <w:r>
+              <w:t>61.72</w:t>
+            </w:r>
           </w:p>
         </w:tc>
         <w:tc>
@@ -984,6 +987,9 @@
                 <w:szCs w:val="16"/>
               </w:rPr>
             </w:pPr>
+            <w:r>
+              <w:t>37.90</w:t>
+            </w:r>
           </w:p>
         </w:tc>
         <w:tc>
@@ -1014,6 +1020,9 @@
                 <w:szCs w:val="16"/>
               </w:rPr>
             </w:pPr>
+            <w:r>
+              <w:t>76.80</w:t>
+            </w:r>
           </w:p>
         </w:tc>
         <w:tc>
@@ -1044,6 +1053,9 @@
                 <w:szCs w:val="16"/>
               </w:rPr>
             </w:pPr>
+            <w:r>
+              <w:t>40.80</w:t>
+            </w:r>
           </w:p>
         </w:tc>
         <w:tc>
@@ -1074,11 +1086,14 @@
                 <w:szCs w:val="16"/>
               </w:rPr>
             </w:pPr>
-          </w:p>
-        </w:tc>
-        <w:tc>
-          <w:tcPr>
-            <w:tcW w:w="362" w:type="pct"/>
+            <w:r>
+              <w:t>12.80</w:t>
+            </w:r>
+          </w:p>
+        </w:tc>
+        <w:tc>
+          <w:tcPr>
+            <w:tcW w:w="363" w:type="pct"/>
             <w:tcBorders>
               <w:top w:val="single" w:sz="6" w:space="0" w:color="333333"/>
               <w:left w:val="single" w:sz="4" w:space="0" w:color="888888"/>
@@ -1104,6 +1119,9 @@
                 <w:szCs w:val="16"/>
               </w:rPr>
             </w:pPr>
+            <w:r>
+              <w:t>33.89</w:t>
+            </w:r>
           </w:p>
         </w:tc>
         <w:tc>
@@ -1134,6 +1152,9 @@
                 <w:szCs w:val="16"/>
               </w:rPr>
             </w:pPr>
+            <w:r>
+              <w:t>77.90</w:t>
+            </w:r>
           </w:p>
         </w:tc>
         <w:tc>
@@ -1164,6 +1185,9 @@
                 <w:szCs w:val="16"/>
               </w:rPr>
             </w:pPr>
+            <w:r>
+              <w:t>50.86</w:t>
+            </w:r>
           </w:p>
         </w:tc>
         <w:tc>
@@ -1194,11 +1218,14 @@
                 <w:szCs w:val="16"/>
               </w:rPr>
             </w:pPr>
-          </w:p>
-        </w:tc>
-        <w:tc>
-          <w:tcPr>
-            <w:tcW w:w="401" w:type="pct"/>
+            <w:r>
+              <w:t>74.52</w:t>
+            </w:r>
+          </w:p>
+        </w:tc>
+        <w:tc>
+          <w:tcPr>
+            <w:tcW w:w="400" w:type="pct"/>
             <w:tcBorders>
               <w:top w:val="single" w:sz="6" w:space="0" w:color="333333"/>
               <w:left w:val="single" w:sz="4" w:space="0" w:color="888888"/>
@@ -1224,6 +1251,9 @@
                 <w:szCs w:val="16"/>
               </w:rPr>
             </w:pPr>
+            <w:r>
+              <w:t>51.22</w:t>
+            </w:r>
           </w:p>
         </w:tc>
       </w:tr>
@@ -1321,6 +1351,9 @@
                 <w:szCs w:val="16"/>
               </w:rPr>
             </w:pPr>
+            <w:r>
+              <w:t>59.14</w:t>
+            </w:r>
           </w:p>
         </w:tc>
         <w:tc>
@@ -1351,6 +1384,9 @@
                 <w:szCs w:val="16"/>
               </w:rPr>
             </w:pPr>
+            <w:r>
+              <w:t>35.99</w:t>
+            </w:r>
           </w:p>
         </w:tc>
         <w:tc>
@@ -1381,6 +1417,9 @@
                 <w:szCs w:val="16"/>
               </w:rPr>
             </w:pPr>
+            <w:r>
+              <w:t>71.57</w:t>
+            </w:r>
           </w:p>
         </w:tc>
         <w:tc>
@@ -1411,6 +1450,9 @@
                 <w:szCs w:val="16"/>
               </w:rPr>
             </w:pPr>
+            <w:r>
+              <w:t>38.60</w:t>
+            </w:r>
           </w:p>
         </w:tc>
         <w:tc>
@@ -1441,11 +1483,14 @@
                 <w:szCs w:val="16"/>
               </w:rPr>
             </w:pPr>
-          </w:p>
-        </w:tc>
-        <w:tc>
-          <w:tcPr>
-            <w:tcW w:w="362" w:type="pct"/>
+            <w:r>
+              <w:t>13.91</w:t>
+            </w:r>
+          </w:p>
+        </w:tc>
+        <w:tc>
+          <w:tcPr>
+            <w:tcW w:w="363" w:type="pct"/>
             <w:tcBorders>
               <w:top w:val="single" w:sz="2" w:space="0" w:color="BBBBBB"/>
               <w:left w:val="single" w:sz="4" w:space="0" w:color="888888"/>
@@ -1471,6 +1516,9 @@
                 <w:szCs w:val="16"/>
               </w:rPr>
             </w:pPr>
+            <w:r>
+              <w:t>36.58</w:t>
+            </w:r>
           </w:p>
         </w:tc>
         <w:tc>
@@ -1501,6 +1549,9 @@
                 <w:szCs w:val="16"/>
               </w:rPr>
             </w:pPr>
+            <w:r>
+              <w:t>75.26</w:t>
+            </w:r>
           </w:p>
         </w:tc>
         <w:tc>
@@ -1531,6 +1582,9 @@
                 <w:szCs w:val="16"/>
               </w:rPr>
             </w:pPr>
+            <w:r>
+              <w:t>49.94</w:t>
+            </w:r>
           </w:p>
         </w:tc>
         <w:tc>
@@ -1561,11 +1615,14 @@
                 <w:szCs w:val="16"/>
               </w:rPr>
             </w:pPr>
-          </w:p>
-        </w:tc>
-        <w:tc>
-          <w:tcPr>
-            <w:tcW w:w="401" w:type="pct"/>
+            <w:r>
+              <w:t>74.97</w:t>
+            </w:r>
+          </w:p>
+        </w:tc>
+        <w:tc>
+          <w:tcPr>
+            <w:tcW w:w="400" w:type="pct"/>
             <w:tcBorders>
               <w:top w:val="single" w:sz="2" w:space="0" w:color="BBBBBB"/>
               <w:left w:val="single" w:sz="4" w:space="0" w:color="888888"/>
@@ -1591,6 +1648,9 @@
                 <w:szCs w:val="16"/>
               </w:rPr>
             </w:pPr>
+            <w:r>
+              <w:t>51.22</w:t>
+            </w:r>
           </w:p>
         </w:tc>
       </w:tr>
@@ -1702,6 +1762,9 @@
                 <w:szCs w:val="16"/>
               </w:rPr>
             </w:pPr>
+            <w:r>
+              <w:t>66.82</w:t>
+            </w:r>
           </w:p>
         </w:tc>
         <w:tc>
@@ -1732,6 +1795,9 @@
                 <w:szCs w:val="16"/>
               </w:rPr>
             </w:pPr>
+            <w:r>
+              <w:t>30.61</w:t>
+            </w:r>
           </w:p>
         </w:tc>
         <w:tc>
@@ -1762,6 +1828,9 @@
                 <w:szCs w:val="16"/>
               </w:rPr>
             </w:pPr>
+            <w:r>
+              <w:t>83.93</w:t>
+            </w:r>
           </w:p>
         </w:tc>
         <w:tc>
@@ -1792,6 +1861,9 @@
                 <w:szCs w:val="16"/>
               </w:rPr>
             </w:pPr>
+            <w:r>
+              <w:t>72.20</w:t>
+            </w:r>
           </w:p>
         </w:tc>
         <w:tc>
@@ -1822,11 +1894,14 @@
                 <w:szCs w:val="16"/>
               </w:rPr>
             </w:pPr>
-          </w:p>
-        </w:tc>
-        <w:tc>
-          <w:tcPr>
-            <w:tcW w:w="362" w:type="pct"/>
+            <w:r>
+              <w:t>17.26</w:t>
+            </w:r>
+          </w:p>
+        </w:tc>
+        <w:tc>
+          <w:tcPr>
+            <w:tcW w:w="363" w:type="pct"/>
             <w:tcBorders>
               <w:top w:val="single" w:sz="6" w:space="0" w:color="333333"/>
               <w:left w:val="single" w:sz="4" w:space="0" w:color="888888"/>
@@ -1852,6 +1927,9 @@
                 <w:szCs w:val="16"/>
               </w:rPr>
             </w:pPr>
+            <w:r>
+              <w:t>51.04</w:t>
+            </w:r>
           </w:p>
         </w:tc>
         <w:tc>
@@ -1882,6 +1960,9 @@
                 <w:szCs w:val="16"/>
               </w:rPr>
             </w:pPr>
+            <w:r>
+              <w:t>87.80</w:t>
+            </w:r>
           </w:p>
         </w:tc>
         <w:tc>
@@ -1912,6 +1993,9 @@
                 <w:szCs w:val="16"/>
               </w:rPr>
             </w:pPr>
+            <w:r>
+              <w:t>51.76</w:t>
+            </w:r>
           </w:p>
         </w:tc>
         <w:tc>
@@ -1942,11 +2026,14 @@
                 <w:szCs w:val="16"/>
               </w:rPr>
             </w:pPr>
-          </w:p>
-        </w:tc>
-        <w:tc>
-          <w:tcPr>
-            <w:tcW w:w="401" w:type="pct"/>
+            <w:r>
+              <w:t>83.05</w:t>
+            </w:r>
+          </w:p>
+        </w:tc>
+        <w:tc>
+          <w:tcPr>
+            <w:tcW w:w="400" w:type="pct"/>
             <w:tcBorders>
               <w:top w:val="single" w:sz="6" w:space="0" w:color="333333"/>
               <w:left w:val="single" w:sz="4" w:space="0" w:color="888888"/>
@@ -1972,6 +2059,9 @@
                 <w:szCs w:val="16"/>
               </w:rPr>
             </w:pPr>
+            <w:r>
+              <w:t>81.71</w:t>
+            </w:r>
           </w:p>
         </w:tc>
       </w:tr>
@@ -2069,6 +2159,9 @@
                 <w:szCs w:val="16"/>
               </w:rPr>
             </w:pPr>
+            <w:r>
+              <w:t>55.95</w:t>
+            </w:r>
           </w:p>
         </w:tc>
         <w:tc>
@@ -2099,6 +2192,9 @@
                 <w:szCs w:val="16"/>
               </w:rPr>
             </w:pPr>
+            <w:r>
+              <w:t>30.19</w:t>
+            </w:r>
           </w:p>
         </w:tc>
         <w:tc>
@@ -2129,6 +2225,9 @@
                 <w:szCs w:val="16"/>
               </w:rPr>
             </w:pPr>
+            <w:r>
+              <w:t>81.43</w:t>
+            </w:r>
           </w:p>
         </w:tc>
         <w:tc>
@@ -2159,6 +2258,9 @@
                 <w:szCs w:val="16"/>
               </w:rPr>
             </w:pPr>
+            <w:r>
+              <w:t>70.20</w:t>
+            </w:r>
           </w:p>
         </w:tc>
         <w:tc>
@@ -2189,11 +2291,14 @@
                 <w:szCs w:val="16"/>
               </w:rPr>
             </w:pPr>
-          </w:p>
-        </w:tc>
-        <w:tc>
-          <w:tcPr>
-            <w:tcW w:w="362" w:type="pct"/>
+            <w:r>
+              <w:t>18.53</w:t>
+            </w:r>
+          </w:p>
+        </w:tc>
+        <w:tc>
+          <w:tcPr>
+            <w:tcW w:w="363" w:type="pct"/>
             <w:tcBorders>
               <w:top w:val="single" w:sz="2" w:space="0" w:color="BBBBBB"/>
               <w:left w:val="single" w:sz="4" w:space="0" w:color="888888"/>
@@ -2219,6 +2324,9 @@
                 <w:szCs w:val="16"/>
               </w:rPr>
             </w:pPr>
+            <w:r>
+              <w:t>54.53</w:t>
+            </w:r>
           </w:p>
         </w:tc>
         <w:tc>
@@ -2249,6 +2357,9 @@
                 <w:szCs w:val="16"/>
               </w:rPr>
             </w:pPr>
+            <w:r>
+              <w:t>85.58</w:t>
+            </w:r>
           </w:p>
         </w:tc>
         <w:tc>
@@ -2279,6 +2390,9 @@
                 <w:szCs w:val="16"/>
               </w:rPr>
             </w:pPr>
+            <w:r>
+              <w:t>51.88</w:t>
+            </w:r>
           </w:p>
         </w:tc>
         <w:tc>
@@ -2309,11 +2423,14 @@
                 <w:szCs w:val="16"/>
               </w:rPr>
             </w:pPr>
-          </w:p>
-        </w:tc>
-        <w:tc>
-          <w:tcPr>
-            <w:tcW w:w="401" w:type="pct"/>
+            <w:r>
+              <w:t>82.87</w:t>
+            </w:r>
+          </w:p>
+        </w:tc>
+        <w:tc>
+          <w:tcPr>
+            <w:tcW w:w="400" w:type="pct"/>
             <w:tcBorders>
               <w:top w:val="single" w:sz="2" w:space="0" w:color="BBBBBB"/>
               <w:left w:val="single" w:sz="4" w:space="0" w:color="888888"/>
@@ -2339,6 +2456,9 @@
                 <w:szCs w:val="16"/>
               </w:rPr>
             </w:pPr>
+            <w:r>
+              <w:t>79.88</w:t>
+            </w:r>
           </w:p>
         </w:tc>
       </w:tr>
@@ -2450,6 +2570,9 @@
                 <w:szCs w:val="16"/>
               </w:rPr>
             </w:pPr>
+            <w:r>
+              <w:t>72.15</w:t>
+            </w:r>
           </w:p>
         </w:tc>
         <w:tc>
@@ -2480,6 +2603,9 @@
                 <w:szCs w:val="16"/>
               </w:rPr>
             </w:pPr>
+            <w:r>
+              <w:t>39.00</w:t>
+            </w:r>
           </w:p>
         </w:tc>
         <w:tc>
@@ -2510,6 +2636,9 @@
                 <w:szCs w:val="16"/>
               </w:rPr>
             </w:pPr>
+            <w:r>
+              <w:t>92.42</w:t>
+            </w:r>
           </w:p>
         </w:tc>
         <w:tc>
@@ -2540,6 +2669,9 @@
                 <w:szCs w:val="16"/>
               </w:rPr>
             </w:pPr>
+            <w:r>
+              <w:t>68.00</w:t>
+            </w:r>
           </w:p>
         </w:tc>
         <w:tc>
@@ -2570,11 +2702,14 @@
                 <w:szCs w:val="16"/>
               </w:rPr>
             </w:pPr>
-          </w:p>
-        </w:tc>
-        <w:tc>
-          <w:tcPr>
-            <w:tcW w:w="362" w:type="pct"/>
+            <w:r>
+              <w:t>13.53</w:t>
+            </w:r>
+          </w:p>
+        </w:tc>
+        <w:tc>
+          <w:tcPr>
+            <w:tcW w:w="363" w:type="pct"/>
             <w:tcBorders>
               <w:top w:val="single" w:sz="6" w:space="0" w:color="333333"/>
               <w:left w:val="single" w:sz="4" w:space="0" w:color="888888"/>
@@ -2600,6 +2735,9 @@
                 <w:szCs w:val="16"/>
               </w:rPr>
             </w:pPr>
+            <w:r>
+              <w:t>41.22</w:t>
+            </w:r>
           </w:p>
         </w:tc>
         <w:tc>
@@ -2630,6 +2768,9 @@
                 <w:szCs w:val="16"/>
               </w:rPr>
             </w:pPr>
+            <w:r>
+              <w:t>89.59</w:t>
+            </w:r>
           </w:p>
         </w:tc>
         <w:tc>
@@ -2660,6 +2801,9 @@
                 <w:szCs w:val="16"/>
               </w:rPr>
             </w:pPr>
+            <w:r>
+              <w:t>58.16</w:t>
+            </w:r>
           </w:p>
         </w:tc>
         <w:tc>
@@ -2690,11 +2834,14 @@
                 <w:szCs w:val="16"/>
               </w:rPr>
             </w:pPr>
-          </w:p>
-        </w:tc>
-        <w:tc>
-          <w:tcPr>
-            <w:tcW w:w="401" w:type="pct"/>
+            <w:r>
+              <w:t>86.02</w:t>
+            </w:r>
+          </w:p>
+        </w:tc>
+        <w:tc>
+          <w:tcPr>
+            <w:tcW w:w="400" w:type="pct"/>
             <w:tcBorders>
               <w:top w:val="single" w:sz="6" w:space="0" w:color="333333"/>
               <w:left w:val="single" w:sz="4" w:space="0" w:color="888888"/>
@@ -2720,6 +2867,9 @@
                 <w:szCs w:val="16"/>
               </w:rPr>
             </w:pPr>
+            <w:r>
+              <w:t>89.63</w:t>
+            </w:r>
           </w:p>
         </w:tc>
       </w:tr>
@@ -2817,6 +2967,9 @@
                 <w:szCs w:val="16"/>
               </w:rPr>
             </w:pPr>
+            <w:r>
+              <w:t>70.35</w:t>
+            </w:r>
           </w:p>
         </w:tc>
         <w:tc>
@@ -2847,6 +3000,9 @@
                 <w:szCs w:val="16"/>
               </w:rPr>
             </w:pPr>
+            <w:r>
+              <w:t>41.65</w:t>
+            </w:r>
           </w:p>
         </w:tc>
         <w:tc>
@@ -2878,12 +3034,6 @@
               </w:rPr>
             </w:pPr>
             <w:r>
-              <w:rPr>
-                <w:rFonts w:asciiTheme="minorBidi" w:hAnsiTheme="minorBidi" w:cstheme="minorBidi"/>
-                <w:color w:val="000000" w:themeColor="text1"/>
-                <w:sz w:val="16"/>
-                <w:szCs w:val="16"/>
-              </w:rPr>
               <w:t>N/A</w:t>
             </w:r>
           </w:p>
@@ -2916,6 +3066,9 @@
                 <w:szCs w:val="16"/>
               </w:rPr>
             </w:pPr>
+            <w:r>
+              <w:t>66.00</w:t>
+            </w:r>
           </w:p>
         </w:tc>
         <w:tc>
@@ -2946,11 +3099,14 @@
                 <w:szCs w:val="16"/>
               </w:rPr>
             </w:pPr>
-          </w:p>
-        </w:tc>
-        <w:tc>
-          <w:tcPr>
-            <w:tcW w:w="362" w:type="pct"/>
+            <w:r>
+              <w:t>14.36</w:t>
+            </w:r>
+          </w:p>
+        </w:tc>
+        <w:tc>
+          <w:tcPr>
+            <w:tcW w:w="363" w:type="pct"/>
             <w:tcBorders>
               <w:top w:val="single" w:sz="2" w:space="0" w:color="BBBBBB"/>
               <w:left w:val="single" w:sz="4" w:space="0" w:color="888888"/>
@@ -2976,6 +3132,9 @@
                 <w:szCs w:val="16"/>
               </w:rPr>
             </w:pPr>
+            <w:r>
+              <w:t>43.45</w:t>
+            </w:r>
           </w:p>
         </w:tc>
         <w:tc>
@@ -3006,6 +3165,9 @@
                 <w:szCs w:val="16"/>
               </w:rPr>
             </w:pPr>
+            <w:r>
+              <w:t>87.97</w:t>
+            </w:r>
           </w:p>
         </w:tc>
         <w:tc>
@@ -3036,6 +3198,9 @@
                 <w:szCs w:val="16"/>
               </w:rPr>
             </w:pPr>
+            <w:r>
+              <w:t>57.28</w:t>
+            </w:r>
           </w:p>
         </w:tc>
         <w:tc>
@@ -3066,11 +3231,14 @@
                 <w:szCs w:val="16"/>
               </w:rPr>
             </w:pPr>
-          </w:p>
-        </w:tc>
-        <w:tc>
-          <w:tcPr>
-            <w:tcW w:w="401" w:type="pct"/>
+            <w:r>
+              <w:t>85.53</w:t>
+            </w:r>
+          </w:p>
+        </w:tc>
+        <w:tc>
+          <w:tcPr>
+            <w:tcW w:w="400" w:type="pct"/>
             <w:tcBorders>
               <w:top w:val="single" w:sz="2" w:space="0" w:color="BBBBBB"/>
               <w:left w:val="single" w:sz="4" w:space="0" w:color="888888"/>
@@ -3096,6 +3264,9 @@
                 <w:szCs w:val="16"/>
               </w:rPr>
             </w:pPr>
+            <w:r>
+              <w:t>86.59</w:t>
+            </w:r>
           </w:p>
         </w:tc>
       </w:tr>
@@ -3207,6 +3378,9 @@
                 <w:szCs w:val="16"/>
               </w:rPr>
             </w:pPr>
+            <w:r>
+              <w:t>68.02</w:t>
+            </w:r>
           </w:p>
         </w:tc>
         <w:tc>
@@ -3237,6 +3411,9 @@
                 <w:szCs w:val="16"/>
               </w:rPr>
             </w:pPr>
+            <w:r>
+              <w:t>47.91</w:t>
+            </w:r>
           </w:p>
         </w:tc>
         <w:tc>
@@ -3267,6 +3444,9 @@
                 <w:szCs w:val="16"/>
               </w:rPr>
             </w:pPr>
+            <w:r>
+              <w:t>86.66</w:t>
+            </w:r>
           </w:p>
         </w:tc>
         <w:tc>
@@ -3297,6 +3477,9 @@
                 <w:szCs w:val="16"/>
               </w:rPr>
             </w:pPr>
+            <w:r>
+              <w:t>55.20</w:t>
+            </w:r>
           </w:p>
         </w:tc>
         <w:tc>
@@ -3327,11 +3510,14 @@
                 <w:szCs w:val="16"/>
               </w:rPr>
             </w:pPr>
-          </w:p>
-        </w:tc>
-        <w:tc>
-          <w:tcPr>
-            <w:tcW w:w="362" w:type="pct"/>
+            <w:r>
+              <w:t>11.12</w:t>
+            </w:r>
+          </w:p>
+        </w:tc>
+        <w:tc>
+          <w:tcPr>
+            <w:tcW w:w="363" w:type="pct"/>
             <w:tcBorders>
               <w:top w:val="single" w:sz="6" w:space="0" w:color="333333"/>
               <w:left w:val="single" w:sz="4" w:space="0" w:color="888888"/>
@@ -3357,6 +3543,9 @@
                 <w:szCs w:val="16"/>
               </w:rPr>
             </w:pPr>
+            <w:r>
+              <w:t>31.84</w:t>
+            </w:r>
           </w:p>
         </w:tc>
         <w:tc>
@@ -3387,6 +3576,9 @@
                 <w:szCs w:val="16"/>
               </w:rPr>
             </w:pPr>
+            <w:r>
+              <w:t>83.11</w:t>
+            </w:r>
           </w:p>
         </w:tc>
         <w:tc>
@@ -3417,6 +3609,9 @@
                 <w:szCs w:val="16"/>
               </w:rPr>
             </w:pPr>
+            <w:r>
+              <w:t>50.88</w:t>
+            </w:r>
           </w:p>
         </w:tc>
         <w:tc>
@@ -3447,11 +3642,14 @@
                 <w:szCs w:val="16"/>
               </w:rPr>
             </w:pPr>
-          </w:p>
-        </w:tc>
-        <w:tc>
-          <w:tcPr>
-            <w:tcW w:w="401" w:type="pct"/>
+            <w:r>
+              <w:t>74.64</w:t>
+            </w:r>
+          </w:p>
+        </w:tc>
+        <w:tc>
+          <w:tcPr>
+            <w:tcW w:w="400" w:type="pct"/>
             <w:tcBorders>
               <w:top w:val="single" w:sz="6" w:space="0" w:color="333333"/>
               <w:left w:val="single" w:sz="4" w:space="0" w:color="888888"/>
@@ -3477,6 +3675,9 @@
                 <w:szCs w:val="16"/>
               </w:rPr>
             </w:pPr>
+            <w:r>
+              <w:t>75.61</w:t>
+            </w:r>
           </w:p>
         </w:tc>
       </w:tr>
@@ -3574,6 +3775,9 @@
                 <w:szCs w:val="16"/>
               </w:rPr>
             </w:pPr>
+            <w:r>
+              <w:t>65.24</w:t>
+            </w:r>
           </w:p>
         </w:tc>
         <w:tc>
@@ -3604,6 +3808,9 @@
                 <w:szCs w:val="16"/>
               </w:rPr>
             </w:pPr>
+            <w:r>
+              <w:t>43.98</w:t>
+            </w:r>
           </w:p>
         </w:tc>
         <w:tc>
@@ -3634,6 +3841,9 @@
                 <w:szCs w:val="16"/>
               </w:rPr>
             </w:pPr>
+            <w:r>
+              <w:t>82.56</w:t>
+            </w:r>
           </w:p>
         </w:tc>
         <w:tc>
@@ -3664,6 +3874,9 @@
                 <w:szCs w:val="16"/>
               </w:rPr>
             </w:pPr>
+            <w:r>
+              <w:t>48.80</w:t>
+            </w:r>
           </w:p>
         </w:tc>
         <w:tc>
@@ -3694,11 +3907,14 @@
                 <w:szCs w:val="16"/>
               </w:rPr>
             </w:pPr>
-          </w:p>
-        </w:tc>
-        <w:tc>
-          <w:tcPr>
-            <w:tcW w:w="362" w:type="pct"/>
+            <w:r>
+              <w:t>12.50</w:t>
+            </w:r>
+          </w:p>
+        </w:tc>
+        <w:tc>
+          <w:tcPr>
+            <w:tcW w:w="363" w:type="pct"/>
             <w:tcBorders>
               <w:top w:val="single" w:sz="2" w:space="0" w:color="BBBBBB"/>
               <w:left w:val="single" w:sz="4" w:space="0" w:color="888888"/>
@@ -3724,6 +3940,9 @@
                 <w:szCs w:val="16"/>
               </w:rPr>
             </w:pPr>
+            <w:r>
+              <w:t>39.03</w:t>
+            </w:r>
           </w:p>
         </w:tc>
         <w:tc>
@@ -3754,6 +3973,9 @@
                 <w:szCs w:val="16"/>
               </w:rPr>
             </w:pPr>
+            <w:r>
+              <w:t>81.14</w:t>
+            </w:r>
           </w:p>
         </w:tc>
         <w:tc>
@@ -3784,6 +4006,9 @@
                 <w:szCs w:val="16"/>
               </w:rPr>
             </w:pPr>
+            <w:r>
+              <w:t>52.11</w:t>
+            </w:r>
           </w:p>
         </w:tc>
         <w:tc>
@@ -3814,11 +4039,14 @@
                 <w:szCs w:val="16"/>
               </w:rPr>
             </w:pPr>
-          </w:p>
-        </w:tc>
-        <w:tc>
-          <w:tcPr>
-            <w:tcW w:w="401" w:type="pct"/>
+            <w:r>
+              <w:t>70.72</w:t>
+            </w:r>
+          </w:p>
+        </w:tc>
+        <w:tc>
+          <w:tcPr>
+            <w:tcW w:w="400" w:type="pct"/>
             <w:tcBorders>
               <w:top w:val="single" w:sz="2" w:space="0" w:color="BBBBBB"/>
               <w:left w:val="single" w:sz="4" w:space="0" w:color="888888"/>
@@ -3844,6 +4072,9 @@
                 <w:szCs w:val="16"/>
               </w:rPr>
             </w:pPr>
+            <w:r>
+              <w:t>68.90</w:t>
+            </w:r>
           </w:p>
         </w:tc>
       </w:tr>

</xml_diff>